<commit_message>
test: pin the fixture's complex-script font
The repaired-line assertion encoded "the measurer always over-reserves". That
held for the macOS Arabic fallback and failed on Linux, where the same line
painted 259.56px against 257.05px measured.

The direction is a property of the font, not of the repair: joined forms are
narrower than isolated ones in some faces and wider in others. With the face
left to whatever the machine has installed, the test measured the runner's font
inventory rather than folio.

Pin the fixture's complex-script font to Noto Sans Arabic, which folio-react
already loads as a webfont in both 400 and 700, so the relationship is the same
everywhere. Correct the residual note in the engine, which made the same wrong
claim about direction.
</commit_message>
<xml_diff>
--- a/tests/visual/fixtures/cursive-face-change.docx
+++ b/tests/visual/fixtures/cursive-face-change.docx
@@ -158,7 +158,13 @@
   <w:docDefaults>
     <w:rPrDefault>
       <w:rPr>
-        <w:rFonts w:ascii="Arial" w:hAnsi="Arial" w:cs="Arial"/>
+        <!-- Pin the complex-script face. Without this the runner's own Arabic
+             fallback decides the advances, and the joined-versus-unjoined width
+             relationship differs per font, so the same assertion passed on one
+             OS and failed on another. folio-react loads Noto Sans Arabic 400
+             and 700 as webfonts, so both weights this fixture needs resolve to
+             the same face everywhere. -->
+        <w:rFonts w:ascii="Arial" w:hAnsi="Arial" w:cs="Noto Sans Arabic"/>
         <w:sz w:val="28"/>
         <w:szCs w:val="28"/>
       </w:rPr>

</xml_diff>

<commit_message>
test: bound the repaired-line residual by magnitude, not direction
The assertion claimed the measurer always over-reserves on a repaired cursive
line. That is a property of the font, not of the repair: unpinned it was -2.7px
on the macOS Arabic fallback and +2.5px on the Linux one, so CI failed.

Bound the magnitude instead. The residual can push a line either way, which
means it is not the safe over-reservation the engine comment also claimed; that
note is corrected too.

Pinning the fixture to a bundled webfont was tried and reverted: the painted
text then used Noto Sans Arabic while the measurer, which runs before the
webfont loads, measured a fallback face, a 64px divergence on a 194px line.
That font-loading race is a real separate defect and is noted in the fixture.
</commit_message>
<xml_diff>
--- a/tests/visual/fixtures/cursive-face-change.docx
+++ b/tests/visual/fixtures/cursive-face-change.docx
@@ -158,13 +158,13 @@
   <w:docDefaults>
     <w:rPrDefault>
       <w:rPr>
-        <!-- Pin the complex-script face. Without this the runner's own Arabic
-             fallback decides the advances, and the joined-versus-unjoined width
-             relationship differs per font, so the same assertion passed on one
-             OS and failed on another. folio-react loads Noto Sans Arabic 400
-             and 700 as webfonts, so both weights this fixture needs resolve to
-             the same face everywhere. -->
-        <w:rFonts w:ascii="Arial" w:hAnsi="Arial" w:cs="Noto Sans Arabic"/>
+        <!-- Deliberately NOT a bundled webfont. Pinning one makes the painted
+             text use it while the measurer, which runs before the webfont has
+             loaded, measures a fallback face: a 64px divergence on a 194px line
+             that has nothing to do with cursive joining. That font-loading race
+             is a real and separate defect; this fixture stays on locally
+             available faces so it measures the joining repair alone. -->
+        <w:rFonts w:ascii="Arial" w:hAnsi="Arial" w:cs="Arial"/>
         <w:sz w:val="28"/>
         <w:szCs w:val="28"/>
       </w:rPr>

</xml_diff>